<commit_message>
Minor changes to draft.
</commit_message>
<xml_diff>
--- a/4_drafts/Draft6/Martyn_etal_Draft6_Ib_comments.docx
+++ b/4_drafts/Draft6/Martyn_etal_Draft6_Ib_comments.docx
@@ -16782,7 +16782,21 @@
         <w:rPr>
           <w:rFonts w:cs="Times New Roman" w:ascii="Times New Roman" w:hAnsi="Times New Roman"/>
         </w:rPr>
-        <w:t>. (D) Heatmap of ASVs with differential abundance (DA ASVs; identified via MaAsLin2 and structural zero analysis) in at least one mutant relative to wild-type across compartment-soil combinations. Depleted ASVs are shown in blue, enriched ASVs in red. The top bar indicates taxonomic assignment at the order level (top20 bacterial orders shown; others grouped as “Other”). Numbers in brackets indicate the total DA ASVs per compartment-soil-genotype combination. Bars to the right show the mean cumulative relative abundance of DA ASVs in the corresponding wild-type compartment.</w:t>
+        <w:t>. (D) Heatmap of ASVs with differential abundance (DA ASVs; identified via MaAsLin2 and structural zero analysis) in at least one mutant relative to wild-type across compartment-soil combinations. Depleted ASVs are shown in blue, enriched ASVs in red. The top bar indicates taxonomic assignment at the order level (top</w:t>
+      </w:r>
+      <w:ins w:id="0" w:author="Unknown Author" w:date="2026-02-18T08:39:22Z">
+        <w:r>
+          <w:rPr>
+            <w:rFonts w:cs="Times New Roman" w:ascii="Times New Roman" w:hAnsi="Times New Roman"/>
+          </w:rPr>
+          <w:t xml:space="preserve"> </w:t>
+        </w:r>
+      </w:ins>
+      <w:r>
+        <w:rPr>
+          <w:rFonts w:cs="Times New Roman" w:ascii="Times New Roman" w:hAnsi="Times New Roman"/>
+        </w:rPr>
+        <w:t>20 bacterial orders shown; others grouped as “Other”). Numbers in brackets indicate the total DA ASVs per compartment-soil-genotype combination. Bars to the right show the mean cumulative relative abundance of DA ASVs in the corresponding wild-type compartment.</w:t>
       </w:r>
     </w:p>
     <w:p>
@@ -16901,7 +16915,7 @@
         </w:rPr>
         <w:t xml:space="preserve"> </w:t>
       </w:r>
-      <w:del w:id="1" w:author="Unknown Author" w:date="2026-02-18T08:32:40Z">
+      <w:del w:id="2" w:author="Unknown Author" w:date="2026-02-18T08:32:40Z">
         <w:r>
           <w:rPr>
             <w:rFonts w:cs="Times New Roman" w:ascii="Times New Roman" w:hAnsi="Times New Roman"/>
@@ -16915,20 +16929,12 @@
         </w:rPr>
         <w:t>p-value</w:t>
       </w:r>
-      <w:ins w:id="2" w:author="Unknown Author" w:date="2026-02-18T08:32:46Z">
-        <w:r>
-          <w:rPr>
-            <w:rFonts w:cs="Times New Roman" w:ascii="Times New Roman" w:hAnsi="Times New Roman"/>
-          </w:rPr>
-          <w:t xml:space="preserve"> </w:t>
-        </w:r>
-      </w:ins>
       <w:ins w:id="3" w:author="Unknown Author" w:date="2026-02-18T08:32:46Z">
         <w:r>
           <w:rPr>
             <w:rFonts w:cs="Times New Roman" w:ascii="Times New Roman" w:hAnsi="Times New Roman"/>
           </w:rPr>
-          <w:t>adjusted for false discovery rate</w:t>
+          <w:t xml:space="preserve"> adjusted for false discovery rate</w:t>
         </w:r>
       </w:ins>
       <w:ins w:id="4" w:author="Unknown Author" w:date="2026-02-18T08:33:00Z">

</xml_diff>